<commit_message>
Stable 2.7.1 Java "Arreglo Campos Devolucion"
</commit_message>
<xml_diff>
--- a/backend/target/classes/plantillas/ListaChequeo.docx
+++ b/backend/target/classes/plantillas/ListaChequeo.docx
@@ -1,6 +1,6 @@
 
 <file path=word/document.xml><?xml version="1.0" encoding="utf-8"?>
-<w:document xmlns:wpc="http://schemas.microsoft.com/office/word/2010/wordprocessingCanvas" xmlns:cx="http://schemas.microsoft.com/office/drawing/2014/chartex" xmlns:cx1="http://schemas.microsoft.com/office/drawing/2015/9/8/chartex" xmlns:cx2="http://schemas.microsoft.com/office/drawing/2015/10/21/chartex" xmlns:cx3="http://schemas.microsoft.com/office/drawing/2016/5/9/chartex" xmlns:cx4="http://schemas.microsoft.com/office/drawing/2016/5/10/chartex" xmlns:cx5="http://schemas.microsoft.com/office/drawing/2016/5/11/chartex" xmlns:cx6="http://schemas.microsoft.com/office/drawing/2016/5/12/chartex" xmlns:cx7="http://schemas.microsoft.com/office/drawing/2016/5/13/chartex" xmlns:cx8="http://schemas.microsoft.com/office/drawing/2016/5/14/chartex" xmlns:mc="http://schemas.openxmlformats.org/markup-compatibility/2006" xmlns:aink="http://schemas.microsoft.com/office/drawing/2016/ink" xmlns:am3d="http://schemas.microsoft.com/office/drawing/2017/model3d" xmlns:o="urn:schemas-microsoft-com:office:office" xmlns:oel="http://schemas.microsoft.com/office/2019/extlst" xmlns:r="http://schemas.openxmlformats.org/officeDocument/2006/relationships" xmlns:m="http://schemas.openxmlformats.org/officeDocument/2006/math" xmlns:v="urn:schemas-microsoft-com:vml" xmlns:wp14="http://schemas.microsoft.com/office/word/2010/wordprocessingDrawing" xmlns:wp="http://schemas.openxmlformats.org/drawingml/2006/wordprocessingDrawing" xmlns:w10="urn:schemas-microsoft-com:office:word" xmlns:w="http://schemas.openxmlformats.org/wordprocessingml/2006/main" xmlns:w14="http://schemas.microsoft.com/office/word/2010/wordml" xmlns:w15="http://schemas.microsoft.com/office/word/2012/wordml" xmlns:w16cex="http://schemas.microsoft.com/office/word/2018/wordml/cex" xmlns:w16cid="http://schemas.microsoft.com/office/word/2016/wordml/cid" xmlns:w16="http://schemas.microsoft.com/office/word/2018/wordml" xmlns:w16du="http://schemas.microsoft.com/office/word/2023/wordml/word16du" xmlns:w16sdtdh="http://schemas.microsoft.com/office/word/2020/wordml/sdtdatahash" xmlns:w16sdtfl="http://schemas.microsoft.com/office/word/2024/wordml/sdtformatlock" xmlns:w16se="http://schemas.microsoft.com/office/word/2015/wordml/symex" xmlns:wpg="http://schemas.microsoft.com/office/word/2010/wordprocessingGroup" xmlns:wpi="http://schemas.microsoft.com/office/word/2010/wordprocessingInk" xmlns:wne="http://schemas.microsoft.com/office/word/2006/wordml" xmlns:wps="http://schemas.microsoft.com/office/word/2010/wordprocessingShape" mc:Ignorable="w14 w15 w16se w16cid w16 w16cex w16sdtdh w16sdtfl w16du wp14">
+<w:document xmlns:wpc="http://schemas.microsoft.com/office/word/2010/wordprocessingCanvas" xmlns:cx="http://schemas.microsoft.com/office/drawing/2014/chartex" xmlns:cx1="http://schemas.microsoft.com/office/drawing/2015/9/8/chartex" xmlns:cx2="http://schemas.microsoft.com/office/drawing/2015/10/21/chartex" xmlns:cx3="http://schemas.microsoft.com/office/drawing/2016/5/9/chartex" xmlns:cx4="http://schemas.microsoft.com/office/drawing/2016/5/10/chartex" xmlns:cx5="http://schemas.microsoft.com/office/drawing/2016/5/11/chartex" xmlns:cx6="http://schemas.microsoft.com/office/drawing/2016/5/12/chartex" xmlns:cx7="http://schemas.microsoft.com/office/drawing/2016/5/13/chartex" xmlns:cx8="http://schemas.microsoft.com/office/drawing/2016/5/14/chartex" xmlns:mc="http://schemas.openxmlformats.org/markup-compatibility/2006" xmlns:aink="http://schemas.microsoft.com/office/drawing/2016/ink" xmlns:am3d="http://schemas.microsoft.com/office/drawing/2017/model3d" xmlns:o="urn:schemas-microsoft-com:office:office" xmlns:oel="http://schemas.microsoft.com/office/2019/extlst" xmlns:r="http://schemas.openxmlformats.org/officeDocument/2006/relationships" xmlns:m="http://schemas.openxmlformats.org/officeDocument/2006/math" xmlns:v="urn:schemas-microsoft-com:vml" xmlns:wp14="http://schemas.microsoft.com/office/word/2010/wordprocessingDrawing" xmlns:wp="http://schemas.openxmlformats.org/drawingml/2006/wordprocessingDrawing" xmlns:w10="urn:schemas-microsoft-com:office:word" xmlns:w="http://schemas.openxmlformats.org/wordprocessingml/2006/main" xmlns:w14="http://schemas.microsoft.com/office/word/2010/wordml" xmlns:w15="http://schemas.microsoft.com/office/word/2012/wordml" xmlns:w16cei="http://schemas.microsoft.com/office/word/2026/wordml/cei" xmlns:w16cex="http://schemas.microsoft.com/office/word/2018/wordml/cex" xmlns:w16cid="http://schemas.microsoft.com/office/word/2016/wordml/cid" xmlns:w16="http://schemas.microsoft.com/office/word/2018/wordml" xmlns:w16du="http://schemas.microsoft.com/office/word/2023/wordml/word16du" xmlns:w16sdtdh="http://schemas.microsoft.com/office/word/2020/wordml/sdtdatahash" xmlns:w16sdtfl="http://schemas.microsoft.com/office/word/2024/wordml/sdtformatlock" xmlns:w16se="http://schemas.microsoft.com/office/word/2015/wordml/symex" xmlns:wpg="http://schemas.microsoft.com/office/word/2010/wordprocessingGroup" xmlns:wpi="http://schemas.microsoft.com/office/word/2010/wordprocessingInk" xmlns:wne="http://schemas.microsoft.com/office/word/2006/wordml" xmlns:wps="http://schemas.microsoft.com/office/word/2010/wordprocessingShape" mc:Ignorable="w14 w15 w16se w16cid w16 w16cex w16sdtdh w16sdtfl w16du wp14">
   <w:body>
     <w:p>
       <w:pPr>
@@ -9971,33 +9971,7 @@
         <w:rPr>
           <w:rFonts w:ascii="Times New Roman"/>
           <w:sz w:val="20"/>
-        </w:rPr>
-      </w:pPr>
-    </w:p>
-    <w:p>
-      <w:pPr>
-        <w:pStyle w:val="Textoindependiente"/>
-        <w:rPr>
-          <w:rFonts w:ascii="Times New Roman"/>
-          <w:sz w:val="20"/>
-        </w:rPr>
-      </w:pPr>
-    </w:p>
-    <w:p>
-      <w:pPr>
-        <w:pStyle w:val="Textoindependiente"/>
-        <w:rPr>
-          <w:rFonts w:ascii="Times New Roman"/>
-          <w:sz w:val="20"/>
-        </w:rPr>
-      </w:pPr>
-    </w:p>
-    <w:p>
-      <w:pPr>
-        <w:pStyle w:val="Textoindependiente"/>
-        <w:rPr>
-          <w:rFonts w:ascii="Times New Roman"/>
-          <w:sz w:val="20"/>
+          <w:u w:val="single"/>
         </w:rPr>
       </w:pPr>
     </w:p>
@@ -10205,7 +10179,6 @@
         <w:rPr>
           <w:w w:val="80"/>
         </w:rPr>
-        <w:lastRenderedPageBreak/>
         <w:t>Firma</w:t>
       </w:r>
       <w:r>
@@ -10303,7 +10276,7 @@
 </file>
 
 <file path=word/endnotes.xml><?xml version="1.0" encoding="utf-8"?>
-<w:endnotes xmlns:wpc="http://schemas.microsoft.com/office/word/2010/wordprocessingCanvas" xmlns:cx="http://schemas.microsoft.com/office/drawing/2014/chartex" xmlns:cx1="http://schemas.microsoft.com/office/drawing/2015/9/8/chartex" xmlns:cx2="http://schemas.microsoft.com/office/drawing/2015/10/21/chartex" xmlns:cx3="http://schemas.microsoft.com/office/drawing/2016/5/9/chartex" xmlns:cx4="http://schemas.microsoft.com/office/drawing/2016/5/10/chartex" xmlns:cx5="http://schemas.microsoft.com/office/drawing/2016/5/11/chartex" xmlns:cx6="http://schemas.microsoft.com/office/drawing/2016/5/12/chartex" xmlns:cx7="http://schemas.microsoft.com/office/drawing/2016/5/13/chartex" xmlns:cx8="http://schemas.microsoft.com/office/drawing/2016/5/14/chartex" xmlns:mc="http://schemas.openxmlformats.org/markup-compatibility/2006" xmlns:aink="http://schemas.microsoft.com/office/drawing/2016/ink" xmlns:am3d="http://schemas.microsoft.com/office/drawing/2017/model3d" xmlns:o="urn:schemas-microsoft-com:office:office" xmlns:oel="http://schemas.microsoft.com/office/2019/extlst" xmlns:r="http://schemas.openxmlformats.org/officeDocument/2006/relationships" xmlns:m="http://schemas.openxmlformats.org/officeDocument/2006/math" xmlns:v="urn:schemas-microsoft-com:vml" xmlns:wp14="http://schemas.microsoft.com/office/word/2010/wordprocessingDrawing" xmlns:wp="http://schemas.openxmlformats.org/drawingml/2006/wordprocessingDrawing" xmlns:w10="urn:schemas-microsoft-com:office:word" xmlns:w="http://schemas.openxmlformats.org/wordprocessingml/2006/main" xmlns:w14="http://schemas.microsoft.com/office/word/2010/wordml" xmlns:w15="http://schemas.microsoft.com/office/word/2012/wordml" xmlns:w16cex="http://schemas.microsoft.com/office/word/2018/wordml/cex" xmlns:w16cid="http://schemas.microsoft.com/office/word/2016/wordml/cid" xmlns:w16="http://schemas.microsoft.com/office/word/2018/wordml" xmlns:w16du="http://schemas.microsoft.com/office/word/2023/wordml/word16du" xmlns:w16sdtdh="http://schemas.microsoft.com/office/word/2020/wordml/sdtdatahash" xmlns:w16sdtfl="http://schemas.microsoft.com/office/word/2024/wordml/sdtformatlock" xmlns:w16se="http://schemas.microsoft.com/office/word/2015/wordml/symex" xmlns:wpg="http://schemas.microsoft.com/office/word/2010/wordprocessingGroup" xmlns:wpi="http://schemas.microsoft.com/office/word/2010/wordprocessingInk" xmlns:wne="http://schemas.microsoft.com/office/word/2006/wordml" xmlns:wps="http://schemas.microsoft.com/office/word/2010/wordprocessingShape" mc:Ignorable="w14 w15 w16se w16cid w16 w16cex w16sdtdh w16sdtfl w16du wp14">
+<w:endnotes xmlns:wpc="http://schemas.microsoft.com/office/word/2010/wordprocessingCanvas" xmlns:cx="http://schemas.microsoft.com/office/drawing/2014/chartex" xmlns:cx1="http://schemas.microsoft.com/office/drawing/2015/9/8/chartex" xmlns:cx2="http://schemas.microsoft.com/office/drawing/2015/10/21/chartex" xmlns:cx3="http://schemas.microsoft.com/office/drawing/2016/5/9/chartex" xmlns:cx4="http://schemas.microsoft.com/office/drawing/2016/5/10/chartex" xmlns:cx5="http://schemas.microsoft.com/office/drawing/2016/5/11/chartex" xmlns:cx6="http://schemas.microsoft.com/office/drawing/2016/5/12/chartex" xmlns:cx7="http://schemas.microsoft.com/office/drawing/2016/5/13/chartex" xmlns:cx8="http://schemas.microsoft.com/office/drawing/2016/5/14/chartex" xmlns:mc="http://schemas.openxmlformats.org/markup-compatibility/2006" xmlns:aink="http://schemas.microsoft.com/office/drawing/2016/ink" xmlns:am3d="http://schemas.microsoft.com/office/drawing/2017/model3d" xmlns:o="urn:schemas-microsoft-com:office:office" xmlns:oel="http://schemas.microsoft.com/office/2019/extlst" xmlns:r="http://schemas.openxmlformats.org/officeDocument/2006/relationships" xmlns:m="http://schemas.openxmlformats.org/officeDocument/2006/math" xmlns:v="urn:schemas-microsoft-com:vml" xmlns:wp14="http://schemas.microsoft.com/office/word/2010/wordprocessingDrawing" xmlns:wp="http://schemas.openxmlformats.org/drawingml/2006/wordprocessingDrawing" xmlns:w10="urn:schemas-microsoft-com:office:word" xmlns:w="http://schemas.openxmlformats.org/wordprocessingml/2006/main" xmlns:w14="http://schemas.microsoft.com/office/word/2010/wordml" xmlns:w15="http://schemas.microsoft.com/office/word/2012/wordml" xmlns:w16cei="http://schemas.microsoft.com/office/word/2026/wordml/cei" xmlns:w16cex="http://schemas.microsoft.com/office/word/2018/wordml/cex" xmlns:w16cid="http://schemas.microsoft.com/office/word/2016/wordml/cid" xmlns:w16="http://schemas.microsoft.com/office/word/2018/wordml" xmlns:w16du="http://schemas.microsoft.com/office/word/2023/wordml/word16du" xmlns:w16sdtdh="http://schemas.microsoft.com/office/word/2020/wordml/sdtdatahash" xmlns:w16sdtfl="http://schemas.microsoft.com/office/word/2024/wordml/sdtformatlock" xmlns:w16se="http://schemas.microsoft.com/office/word/2015/wordml/symex" xmlns:wpg="http://schemas.microsoft.com/office/word/2010/wordprocessingGroup" xmlns:wpi="http://schemas.microsoft.com/office/word/2010/wordprocessingInk" xmlns:wne="http://schemas.microsoft.com/office/word/2006/wordml" xmlns:wps="http://schemas.microsoft.com/office/word/2010/wordprocessingShape" mc:Ignorable="w14 w15 w16se w16cid w16 w16cex w16sdtdh w16sdtfl w16du wp14">
   <w:endnote w:type="separator" w:id="-1">
     <w:p>
       <w:r>
@@ -10322,7 +10295,7 @@
 </file>
 
 <file path=word/footer1.xml><?xml version="1.0" encoding="utf-8"?>
-<w:ftr xmlns:wpc="http://schemas.microsoft.com/office/word/2010/wordprocessingCanvas" xmlns:cx="http://schemas.microsoft.com/office/drawing/2014/chartex" xmlns:cx1="http://schemas.microsoft.com/office/drawing/2015/9/8/chartex" xmlns:cx2="http://schemas.microsoft.com/office/drawing/2015/10/21/chartex" xmlns:cx3="http://schemas.microsoft.com/office/drawing/2016/5/9/chartex" xmlns:cx4="http://schemas.microsoft.com/office/drawing/2016/5/10/chartex" xmlns:cx5="http://schemas.microsoft.com/office/drawing/2016/5/11/chartex" xmlns:cx6="http://schemas.microsoft.com/office/drawing/2016/5/12/chartex" xmlns:cx7="http://schemas.microsoft.com/office/drawing/2016/5/13/chartex" xmlns:cx8="http://schemas.microsoft.com/office/drawing/2016/5/14/chartex" xmlns:mc="http://schemas.openxmlformats.org/markup-compatibility/2006" xmlns:aink="http://schemas.microsoft.com/office/drawing/2016/ink" xmlns:am3d="http://schemas.microsoft.com/office/drawing/2017/model3d" xmlns:o="urn:schemas-microsoft-com:office:office" xmlns:oel="http://schemas.microsoft.com/office/2019/extlst" xmlns:r="http://schemas.openxmlformats.org/officeDocument/2006/relationships" xmlns:m="http://schemas.openxmlformats.org/officeDocument/2006/math" xmlns:v="urn:schemas-microsoft-com:vml" xmlns:wp14="http://schemas.microsoft.com/office/word/2010/wordprocessingDrawing" xmlns:wp="http://schemas.openxmlformats.org/drawingml/2006/wordprocessingDrawing" xmlns:w10="urn:schemas-microsoft-com:office:word" xmlns:w="http://schemas.openxmlformats.org/wordprocessingml/2006/main" xmlns:w14="http://schemas.microsoft.com/office/word/2010/wordml" xmlns:w15="http://schemas.microsoft.com/office/word/2012/wordml" xmlns:w16cex="http://schemas.microsoft.com/office/word/2018/wordml/cex" xmlns:w16cid="http://schemas.microsoft.com/office/word/2016/wordml/cid" xmlns:w16="http://schemas.microsoft.com/office/word/2018/wordml" xmlns:w16du="http://schemas.microsoft.com/office/word/2023/wordml/word16du" xmlns:w16sdtdh="http://schemas.microsoft.com/office/word/2020/wordml/sdtdatahash" xmlns:w16sdtfl="http://schemas.microsoft.com/office/word/2024/wordml/sdtformatlock" xmlns:w16se="http://schemas.microsoft.com/office/word/2015/wordml/symex" xmlns:wpg="http://schemas.microsoft.com/office/word/2010/wordprocessingGroup" xmlns:wpi="http://schemas.microsoft.com/office/word/2010/wordprocessingInk" xmlns:wne="http://schemas.microsoft.com/office/word/2006/wordml" xmlns:wps="http://schemas.microsoft.com/office/word/2010/wordprocessingShape" mc:Ignorable="w14 w15 w16se w16cid w16 w16cex w16sdtdh w16sdtfl w16du wp14">
+<w:ftr xmlns:wpc="http://schemas.microsoft.com/office/word/2010/wordprocessingCanvas" xmlns:cx="http://schemas.microsoft.com/office/drawing/2014/chartex" xmlns:cx1="http://schemas.microsoft.com/office/drawing/2015/9/8/chartex" xmlns:cx2="http://schemas.microsoft.com/office/drawing/2015/10/21/chartex" xmlns:cx3="http://schemas.microsoft.com/office/drawing/2016/5/9/chartex" xmlns:cx4="http://schemas.microsoft.com/office/drawing/2016/5/10/chartex" xmlns:cx5="http://schemas.microsoft.com/office/drawing/2016/5/11/chartex" xmlns:cx6="http://schemas.microsoft.com/office/drawing/2016/5/12/chartex" xmlns:cx7="http://schemas.microsoft.com/office/drawing/2016/5/13/chartex" xmlns:cx8="http://schemas.microsoft.com/office/drawing/2016/5/14/chartex" xmlns:mc="http://schemas.openxmlformats.org/markup-compatibility/2006" xmlns:aink="http://schemas.microsoft.com/office/drawing/2016/ink" xmlns:am3d="http://schemas.microsoft.com/office/drawing/2017/model3d" xmlns:o="urn:schemas-microsoft-com:office:office" xmlns:oel="http://schemas.microsoft.com/office/2019/extlst" xmlns:r="http://schemas.openxmlformats.org/officeDocument/2006/relationships" xmlns:m="http://schemas.openxmlformats.org/officeDocument/2006/math" xmlns:v="urn:schemas-microsoft-com:vml" xmlns:wp14="http://schemas.microsoft.com/office/word/2010/wordprocessingDrawing" xmlns:wp="http://schemas.openxmlformats.org/drawingml/2006/wordprocessingDrawing" xmlns:w10="urn:schemas-microsoft-com:office:word" xmlns:w="http://schemas.openxmlformats.org/wordprocessingml/2006/main" xmlns:w14="http://schemas.microsoft.com/office/word/2010/wordml" xmlns:w15="http://schemas.microsoft.com/office/word/2012/wordml" xmlns:w16cei="http://schemas.microsoft.com/office/word/2026/wordml/cei" xmlns:w16cex="http://schemas.microsoft.com/office/word/2018/wordml/cex" xmlns:w16cid="http://schemas.microsoft.com/office/word/2016/wordml/cid" xmlns:w16="http://schemas.microsoft.com/office/word/2018/wordml" xmlns:w16du="http://schemas.microsoft.com/office/word/2023/wordml/word16du" xmlns:w16sdtdh="http://schemas.microsoft.com/office/word/2020/wordml/sdtdatahash" xmlns:w16sdtfl="http://schemas.microsoft.com/office/word/2024/wordml/sdtformatlock" xmlns:w16se="http://schemas.microsoft.com/office/word/2015/wordml/symex" xmlns:wpg="http://schemas.microsoft.com/office/word/2010/wordprocessingGroup" xmlns:wpi="http://schemas.microsoft.com/office/word/2010/wordprocessingInk" xmlns:wne="http://schemas.microsoft.com/office/word/2006/wordml" xmlns:wps="http://schemas.microsoft.com/office/word/2010/wordprocessingShape" mc:Ignorable="w14 w15 w16se w16cid w16 w16cex w16sdtdh w16sdtfl w16du wp14">
   <w:p>
     <w:pPr>
       <w:pStyle w:val="Piedepgina"/>
@@ -10332,7 +10305,7 @@
 </file>
 
 <file path=word/footer2.xml><?xml version="1.0" encoding="utf-8"?>
-<w:ftr xmlns:wpc="http://schemas.microsoft.com/office/word/2010/wordprocessingCanvas" xmlns:cx="http://schemas.microsoft.com/office/drawing/2014/chartex" xmlns:cx1="http://schemas.microsoft.com/office/drawing/2015/9/8/chartex" xmlns:cx2="http://schemas.microsoft.com/office/drawing/2015/10/21/chartex" xmlns:cx3="http://schemas.microsoft.com/office/drawing/2016/5/9/chartex" xmlns:cx4="http://schemas.microsoft.com/office/drawing/2016/5/10/chartex" xmlns:cx5="http://schemas.microsoft.com/office/drawing/2016/5/11/chartex" xmlns:cx6="http://schemas.microsoft.com/office/drawing/2016/5/12/chartex" xmlns:cx7="http://schemas.microsoft.com/office/drawing/2016/5/13/chartex" xmlns:cx8="http://schemas.microsoft.com/office/drawing/2016/5/14/chartex" xmlns:mc="http://schemas.openxmlformats.org/markup-compatibility/2006" xmlns:aink="http://schemas.microsoft.com/office/drawing/2016/ink" xmlns:am3d="http://schemas.microsoft.com/office/drawing/2017/model3d" xmlns:o="urn:schemas-microsoft-com:office:office" xmlns:oel="http://schemas.microsoft.com/office/2019/extlst" xmlns:r="http://schemas.openxmlformats.org/officeDocument/2006/relationships" xmlns:m="http://schemas.openxmlformats.org/officeDocument/2006/math" xmlns:v="urn:schemas-microsoft-com:vml" xmlns:wp14="http://schemas.microsoft.com/office/word/2010/wordprocessingDrawing" xmlns:wp="http://schemas.openxmlformats.org/drawingml/2006/wordprocessingDrawing" xmlns:w10="urn:schemas-microsoft-com:office:word" xmlns:w="http://schemas.openxmlformats.org/wordprocessingml/2006/main" xmlns:w14="http://schemas.microsoft.com/office/word/2010/wordml" xmlns:w15="http://schemas.microsoft.com/office/word/2012/wordml" xmlns:w16cex="http://schemas.microsoft.com/office/word/2018/wordml/cex" xmlns:w16cid="http://schemas.microsoft.com/office/word/2016/wordml/cid" xmlns:w16="http://schemas.microsoft.com/office/word/2018/wordml" xmlns:w16du="http://schemas.microsoft.com/office/word/2023/wordml/word16du" xmlns:w16sdtdh="http://schemas.microsoft.com/office/word/2020/wordml/sdtdatahash" xmlns:w16sdtfl="http://schemas.microsoft.com/office/word/2024/wordml/sdtformatlock" xmlns:w16se="http://schemas.microsoft.com/office/word/2015/wordml/symex" xmlns:wpg="http://schemas.microsoft.com/office/word/2010/wordprocessingGroup" xmlns:wpi="http://schemas.microsoft.com/office/word/2010/wordprocessingInk" xmlns:wne="http://schemas.microsoft.com/office/word/2006/wordml" xmlns:wps="http://schemas.microsoft.com/office/word/2010/wordprocessingShape" mc:Ignorable="w14 w15 w16se w16cid w16 w16cex w16sdtdh w16sdtfl w16du wp14">
+<w:ftr xmlns:wpc="http://schemas.microsoft.com/office/word/2010/wordprocessingCanvas" xmlns:cx="http://schemas.microsoft.com/office/drawing/2014/chartex" xmlns:cx1="http://schemas.microsoft.com/office/drawing/2015/9/8/chartex" xmlns:cx2="http://schemas.microsoft.com/office/drawing/2015/10/21/chartex" xmlns:cx3="http://schemas.microsoft.com/office/drawing/2016/5/9/chartex" xmlns:cx4="http://schemas.microsoft.com/office/drawing/2016/5/10/chartex" xmlns:cx5="http://schemas.microsoft.com/office/drawing/2016/5/11/chartex" xmlns:cx6="http://schemas.microsoft.com/office/drawing/2016/5/12/chartex" xmlns:cx7="http://schemas.microsoft.com/office/drawing/2016/5/13/chartex" xmlns:cx8="http://schemas.microsoft.com/office/drawing/2016/5/14/chartex" xmlns:mc="http://schemas.openxmlformats.org/markup-compatibility/2006" xmlns:aink="http://schemas.microsoft.com/office/drawing/2016/ink" xmlns:am3d="http://schemas.microsoft.com/office/drawing/2017/model3d" xmlns:o="urn:schemas-microsoft-com:office:office" xmlns:oel="http://schemas.microsoft.com/office/2019/extlst" xmlns:r="http://schemas.openxmlformats.org/officeDocument/2006/relationships" xmlns:m="http://schemas.openxmlformats.org/officeDocument/2006/math" xmlns:v="urn:schemas-microsoft-com:vml" xmlns:wp14="http://schemas.microsoft.com/office/word/2010/wordprocessingDrawing" xmlns:wp="http://schemas.openxmlformats.org/drawingml/2006/wordprocessingDrawing" xmlns:w10="urn:schemas-microsoft-com:office:word" xmlns:w="http://schemas.openxmlformats.org/wordprocessingml/2006/main" xmlns:w14="http://schemas.microsoft.com/office/word/2010/wordml" xmlns:w15="http://schemas.microsoft.com/office/word/2012/wordml" xmlns:w16cei="http://schemas.microsoft.com/office/word/2026/wordml/cei" xmlns:w16cex="http://schemas.microsoft.com/office/word/2018/wordml/cex" xmlns:w16cid="http://schemas.microsoft.com/office/word/2016/wordml/cid" xmlns:w16="http://schemas.microsoft.com/office/word/2018/wordml" xmlns:w16du="http://schemas.microsoft.com/office/word/2023/wordml/word16du" xmlns:w16sdtdh="http://schemas.microsoft.com/office/word/2020/wordml/sdtdatahash" xmlns:w16sdtfl="http://schemas.microsoft.com/office/word/2024/wordml/sdtformatlock" xmlns:w16se="http://schemas.microsoft.com/office/word/2015/wordml/symex" xmlns:wpg="http://schemas.microsoft.com/office/word/2010/wordprocessingGroup" xmlns:wpi="http://schemas.microsoft.com/office/word/2010/wordprocessingInk" xmlns:wne="http://schemas.microsoft.com/office/word/2006/wordml" xmlns:wps="http://schemas.microsoft.com/office/word/2010/wordprocessingShape" mc:Ignorable="w14 w15 w16se w16cid w16 w16cex w16sdtdh w16sdtfl w16du wp14">
   <w:p>
     <w:pPr>
       <w:pStyle w:val="Textoindependiente"/>
@@ -10758,7 +10731,7 @@
 </file>
 
 <file path=word/footer3.xml><?xml version="1.0" encoding="utf-8"?>
-<w:ftr xmlns:wpc="http://schemas.microsoft.com/office/word/2010/wordprocessingCanvas" xmlns:cx="http://schemas.microsoft.com/office/drawing/2014/chartex" xmlns:cx1="http://schemas.microsoft.com/office/drawing/2015/9/8/chartex" xmlns:cx2="http://schemas.microsoft.com/office/drawing/2015/10/21/chartex" xmlns:cx3="http://schemas.microsoft.com/office/drawing/2016/5/9/chartex" xmlns:cx4="http://schemas.microsoft.com/office/drawing/2016/5/10/chartex" xmlns:cx5="http://schemas.microsoft.com/office/drawing/2016/5/11/chartex" xmlns:cx6="http://schemas.microsoft.com/office/drawing/2016/5/12/chartex" xmlns:cx7="http://schemas.microsoft.com/office/drawing/2016/5/13/chartex" xmlns:cx8="http://schemas.microsoft.com/office/drawing/2016/5/14/chartex" xmlns:mc="http://schemas.openxmlformats.org/markup-compatibility/2006" xmlns:aink="http://schemas.microsoft.com/office/drawing/2016/ink" xmlns:am3d="http://schemas.microsoft.com/office/drawing/2017/model3d" xmlns:o="urn:schemas-microsoft-com:office:office" xmlns:oel="http://schemas.microsoft.com/office/2019/extlst" xmlns:r="http://schemas.openxmlformats.org/officeDocument/2006/relationships" xmlns:m="http://schemas.openxmlformats.org/officeDocument/2006/math" xmlns:v="urn:schemas-microsoft-com:vml" xmlns:wp14="http://schemas.microsoft.com/office/word/2010/wordprocessingDrawing" xmlns:wp="http://schemas.openxmlformats.org/drawingml/2006/wordprocessingDrawing" xmlns:w10="urn:schemas-microsoft-com:office:word" xmlns:w="http://schemas.openxmlformats.org/wordprocessingml/2006/main" xmlns:w14="http://schemas.microsoft.com/office/word/2010/wordml" xmlns:w15="http://schemas.microsoft.com/office/word/2012/wordml" xmlns:w16cex="http://schemas.microsoft.com/office/word/2018/wordml/cex" xmlns:w16cid="http://schemas.microsoft.com/office/word/2016/wordml/cid" xmlns:w16="http://schemas.microsoft.com/office/word/2018/wordml" xmlns:w16du="http://schemas.microsoft.com/office/word/2023/wordml/word16du" xmlns:w16sdtdh="http://schemas.microsoft.com/office/word/2020/wordml/sdtdatahash" xmlns:w16sdtfl="http://schemas.microsoft.com/office/word/2024/wordml/sdtformatlock" xmlns:w16se="http://schemas.microsoft.com/office/word/2015/wordml/symex" xmlns:wpg="http://schemas.microsoft.com/office/word/2010/wordprocessingGroup" xmlns:wpi="http://schemas.microsoft.com/office/word/2010/wordprocessingInk" xmlns:wne="http://schemas.microsoft.com/office/word/2006/wordml" xmlns:wps="http://schemas.microsoft.com/office/word/2010/wordprocessingShape" mc:Ignorable="w14 w15 w16se w16cid w16 w16cex w16sdtdh w16sdtfl w16du wp14">
+<w:ftr xmlns:wpc="http://schemas.microsoft.com/office/word/2010/wordprocessingCanvas" xmlns:cx="http://schemas.microsoft.com/office/drawing/2014/chartex" xmlns:cx1="http://schemas.microsoft.com/office/drawing/2015/9/8/chartex" xmlns:cx2="http://schemas.microsoft.com/office/drawing/2015/10/21/chartex" xmlns:cx3="http://schemas.microsoft.com/office/drawing/2016/5/9/chartex" xmlns:cx4="http://schemas.microsoft.com/office/drawing/2016/5/10/chartex" xmlns:cx5="http://schemas.microsoft.com/office/drawing/2016/5/11/chartex" xmlns:cx6="http://schemas.microsoft.com/office/drawing/2016/5/12/chartex" xmlns:cx7="http://schemas.microsoft.com/office/drawing/2016/5/13/chartex" xmlns:cx8="http://schemas.microsoft.com/office/drawing/2016/5/14/chartex" xmlns:mc="http://schemas.openxmlformats.org/markup-compatibility/2006" xmlns:aink="http://schemas.microsoft.com/office/drawing/2016/ink" xmlns:am3d="http://schemas.microsoft.com/office/drawing/2017/model3d" xmlns:o="urn:schemas-microsoft-com:office:office" xmlns:oel="http://schemas.microsoft.com/office/2019/extlst" xmlns:r="http://schemas.openxmlformats.org/officeDocument/2006/relationships" xmlns:m="http://schemas.openxmlformats.org/officeDocument/2006/math" xmlns:v="urn:schemas-microsoft-com:vml" xmlns:wp14="http://schemas.microsoft.com/office/word/2010/wordprocessingDrawing" xmlns:wp="http://schemas.openxmlformats.org/drawingml/2006/wordprocessingDrawing" xmlns:w10="urn:schemas-microsoft-com:office:word" xmlns:w="http://schemas.openxmlformats.org/wordprocessingml/2006/main" xmlns:w14="http://schemas.microsoft.com/office/word/2010/wordml" xmlns:w15="http://schemas.microsoft.com/office/word/2012/wordml" xmlns:w16cei="http://schemas.microsoft.com/office/word/2026/wordml/cei" xmlns:w16cex="http://schemas.microsoft.com/office/word/2018/wordml/cex" xmlns:w16cid="http://schemas.microsoft.com/office/word/2016/wordml/cid" xmlns:w16="http://schemas.microsoft.com/office/word/2018/wordml" xmlns:w16du="http://schemas.microsoft.com/office/word/2023/wordml/word16du" xmlns:w16sdtdh="http://schemas.microsoft.com/office/word/2020/wordml/sdtdatahash" xmlns:w16sdtfl="http://schemas.microsoft.com/office/word/2024/wordml/sdtformatlock" xmlns:w16se="http://schemas.microsoft.com/office/word/2015/wordml/symex" xmlns:wpg="http://schemas.microsoft.com/office/word/2010/wordprocessingGroup" xmlns:wpi="http://schemas.microsoft.com/office/word/2010/wordprocessingInk" xmlns:wne="http://schemas.microsoft.com/office/word/2006/wordml" xmlns:wps="http://schemas.microsoft.com/office/word/2010/wordprocessingShape" mc:Ignorable="w14 w15 w16se w16cid w16 w16cex w16sdtdh w16sdtfl w16du wp14">
   <w:p>
     <w:pPr>
       <w:pStyle w:val="Piedepgina"/>
@@ -10768,7 +10741,7 @@
 </file>
 
 <file path=word/footnotes.xml><?xml version="1.0" encoding="utf-8"?>
-<w:footnotes xmlns:wpc="http://schemas.microsoft.com/office/word/2010/wordprocessingCanvas" xmlns:cx="http://schemas.microsoft.com/office/drawing/2014/chartex" xmlns:cx1="http://schemas.microsoft.com/office/drawing/2015/9/8/chartex" xmlns:cx2="http://schemas.microsoft.com/office/drawing/2015/10/21/chartex" xmlns:cx3="http://schemas.microsoft.com/office/drawing/2016/5/9/chartex" xmlns:cx4="http://schemas.microsoft.com/office/drawing/2016/5/10/chartex" xmlns:cx5="http://schemas.microsoft.com/office/drawing/2016/5/11/chartex" xmlns:cx6="http://schemas.microsoft.com/office/drawing/2016/5/12/chartex" xmlns:cx7="http://schemas.microsoft.com/office/drawing/2016/5/13/chartex" xmlns:cx8="http://schemas.microsoft.com/office/drawing/2016/5/14/chartex" xmlns:mc="http://schemas.openxmlformats.org/markup-compatibility/2006" xmlns:aink="http://schemas.microsoft.com/office/drawing/2016/ink" xmlns:am3d="http://schemas.microsoft.com/office/drawing/2017/model3d" xmlns:o="urn:schemas-microsoft-com:office:office" xmlns:oel="http://schemas.microsoft.com/office/2019/extlst" xmlns:r="http://schemas.openxmlformats.org/officeDocument/2006/relationships" xmlns:m="http://schemas.openxmlformats.org/officeDocument/2006/math" xmlns:v="urn:schemas-microsoft-com:vml" xmlns:wp14="http://schemas.microsoft.com/office/word/2010/wordprocessingDrawing" xmlns:wp="http://schemas.openxmlformats.org/drawingml/2006/wordprocessingDrawing" xmlns:w10="urn:schemas-microsoft-com:office:word" xmlns:w="http://schemas.openxmlformats.org/wordprocessingml/2006/main" xmlns:w14="http://schemas.microsoft.com/office/word/2010/wordml" xmlns:w15="http://schemas.microsoft.com/office/word/2012/wordml" xmlns:w16cex="http://schemas.microsoft.com/office/word/2018/wordml/cex" xmlns:w16cid="http://schemas.microsoft.com/office/word/2016/wordml/cid" xmlns:w16="http://schemas.microsoft.com/office/word/2018/wordml" xmlns:w16du="http://schemas.microsoft.com/office/word/2023/wordml/word16du" xmlns:w16sdtdh="http://schemas.microsoft.com/office/word/2020/wordml/sdtdatahash" xmlns:w16sdtfl="http://schemas.microsoft.com/office/word/2024/wordml/sdtformatlock" xmlns:w16se="http://schemas.microsoft.com/office/word/2015/wordml/symex" xmlns:wpg="http://schemas.microsoft.com/office/word/2010/wordprocessingGroup" xmlns:wpi="http://schemas.microsoft.com/office/word/2010/wordprocessingInk" xmlns:wne="http://schemas.microsoft.com/office/word/2006/wordml" xmlns:wps="http://schemas.microsoft.com/office/word/2010/wordprocessingShape" mc:Ignorable="w14 w15 w16se w16cid w16 w16cex w16sdtdh w16sdtfl w16du wp14">
+<w:footnotes xmlns:wpc="http://schemas.microsoft.com/office/word/2010/wordprocessingCanvas" xmlns:cx="http://schemas.microsoft.com/office/drawing/2014/chartex" xmlns:cx1="http://schemas.microsoft.com/office/drawing/2015/9/8/chartex" xmlns:cx2="http://schemas.microsoft.com/office/drawing/2015/10/21/chartex" xmlns:cx3="http://schemas.microsoft.com/office/drawing/2016/5/9/chartex" xmlns:cx4="http://schemas.microsoft.com/office/drawing/2016/5/10/chartex" xmlns:cx5="http://schemas.microsoft.com/office/drawing/2016/5/11/chartex" xmlns:cx6="http://schemas.microsoft.com/office/drawing/2016/5/12/chartex" xmlns:cx7="http://schemas.microsoft.com/office/drawing/2016/5/13/chartex" xmlns:cx8="http://schemas.microsoft.com/office/drawing/2016/5/14/chartex" xmlns:mc="http://schemas.openxmlformats.org/markup-compatibility/2006" xmlns:aink="http://schemas.microsoft.com/office/drawing/2016/ink" xmlns:am3d="http://schemas.microsoft.com/office/drawing/2017/model3d" xmlns:o="urn:schemas-microsoft-com:office:office" xmlns:oel="http://schemas.microsoft.com/office/2019/extlst" xmlns:r="http://schemas.openxmlformats.org/officeDocument/2006/relationships" xmlns:m="http://schemas.openxmlformats.org/officeDocument/2006/math" xmlns:v="urn:schemas-microsoft-com:vml" xmlns:wp14="http://schemas.microsoft.com/office/word/2010/wordprocessingDrawing" xmlns:wp="http://schemas.openxmlformats.org/drawingml/2006/wordprocessingDrawing" xmlns:w10="urn:schemas-microsoft-com:office:word" xmlns:w="http://schemas.openxmlformats.org/wordprocessingml/2006/main" xmlns:w14="http://schemas.microsoft.com/office/word/2010/wordml" xmlns:w15="http://schemas.microsoft.com/office/word/2012/wordml" xmlns:w16cei="http://schemas.microsoft.com/office/word/2026/wordml/cei" xmlns:w16cex="http://schemas.microsoft.com/office/word/2018/wordml/cex" xmlns:w16cid="http://schemas.microsoft.com/office/word/2016/wordml/cid" xmlns:w16="http://schemas.microsoft.com/office/word/2018/wordml" xmlns:w16du="http://schemas.microsoft.com/office/word/2023/wordml/word16du" xmlns:w16sdtdh="http://schemas.microsoft.com/office/word/2020/wordml/sdtdatahash" xmlns:w16sdtfl="http://schemas.microsoft.com/office/word/2024/wordml/sdtformatlock" xmlns:w16se="http://schemas.microsoft.com/office/word/2015/wordml/symex" xmlns:wpg="http://schemas.microsoft.com/office/word/2010/wordprocessingGroup" xmlns:wpi="http://schemas.microsoft.com/office/word/2010/wordprocessingInk" xmlns:wne="http://schemas.microsoft.com/office/word/2006/wordml" xmlns:wps="http://schemas.microsoft.com/office/word/2010/wordprocessingShape" mc:Ignorable="w14 w15 w16se w16cid w16 w16cex w16sdtdh w16sdtfl w16du wp14">
   <w:footnote w:type="separator" w:id="-1">
     <w:p>
       <w:r>
@@ -10787,7 +10760,7 @@
 </file>
 
 <file path=word/header1.xml><?xml version="1.0" encoding="utf-8"?>
-<w:hdr xmlns:wpc="http://schemas.microsoft.com/office/word/2010/wordprocessingCanvas" xmlns:cx="http://schemas.microsoft.com/office/drawing/2014/chartex" xmlns:cx1="http://schemas.microsoft.com/office/drawing/2015/9/8/chartex" xmlns:cx2="http://schemas.microsoft.com/office/drawing/2015/10/21/chartex" xmlns:cx3="http://schemas.microsoft.com/office/drawing/2016/5/9/chartex" xmlns:cx4="http://schemas.microsoft.com/office/drawing/2016/5/10/chartex" xmlns:cx5="http://schemas.microsoft.com/office/drawing/2016/5/11/chartex" xmlns:cx6="http://schemas.microsoft.com/office/drawing/2016/5/12/chartex" xmlns:cx7="http://schemas.microsoft.com/office/drawing/2016/5/13/chartex" xmlns:cx8="http://schemas.microsoft.com/office/drawing/2016/5/14/chartex" xmlns:mc="http://schemas.openxmlformats.org/markup-compatibility/2006" xmlns:aink="http://schemas.microsoft.com/office/drawing/2016/ink" xmlns:am3d="http://schemas.microsoft.com/office/drawing/2017/model3d" xmlns:o="urn:schemas-microsoft-com:office:office" xmlns:oel="http://schemas.microsoft.com/office/2019/extlst" xmlns:r="http://schemas.openxmlformats.org/officeDocument/2006/relationships" xmlns:m="http://schemas.openxmlformats.org/officeDocument/2006/math" xmlns:v="urn:schemas-microsoft-com:vml" xmlns:wp14="http://schemas.microsoft.com/office/word/2010/wordprocessingDrawing" xmlns:wp="http://schemas.openxmlformats.org/drawingml/2006/wordprocessingDrawing" xmlns:w10="urn:schemas-microsoft-com:office:word" xmlns:w="http://schemas.openxmlformats.org/wordprocessingml/2006/main" xmlns:w14="http://schemas.microsoft.com/office/word/2010/wordml" xmlns:w15="http://schemas.microsoft.com/office/word/2012/wordml" xmlns:w16cex="http://schemas.microsoft.com/office/word/2018/wordml/cex" xmlns:w16cid="http://schemas.microsoft.com/office/word/2016/wordml/cid" xmlns:w16="http://schemas.microsoft.com/office/word/2018/wordml" xmlns:w16du="http://schemas.microsoft.com/office/word/2023/wordml/word16du" xmlns:w16sdtdh="http://schemas.microsoft.com/office/word/2020/wordml/sdtdatahash" xmlns:w16sdtfl="http://schemas.microsoft.com/office/word/2024/wordml/sdtformatlock" xmlns:w16se="http://schemas.microsoft.com/office/word/2015/wordml/symex" xmlns:wpg="http://schemas.microsoft.com/office/word/2010/wordprocessingGroup" xmlns:wpi="http://schemas.microsoft.com/office/word/2010/wordprocessingInk" xmlns:wne="http://schemas.microsoft.com/office/word/2006/wordml" xmlns:wps="http://schemas.microsoft.com/office/word/2010/wordprocessingShape" mc:Ignorable="w14 w15 w16se w16cid w16 w16cex w16sdtdh w16sdtfl w16du wp14">
+<w:hdr xmlns:wpc="http://schemas.microsoft.com/office/word/2010/wordprocessingCanvas" xmlns:cx="http://schemas.microsoft.com/office/drawing/2014/chartex" xmlns:cx1="http://schemas.microsoft.com/office/drawing/2015/9/8/chartex" xmlns:cx2="http://schemas.microsoft.com/office/drawing/2015/10/21/chartex" xmlns:cx3="http://schemas.microsoft.com/office/drawing/2016/5/9/chartex" xmlns:cx4="http://schemas.microsoft.com/office/drawing/2016/5/10/chartex" xmlns:cx5="http://schemas.microsoft.com/office/drawing/2016/5/11/chartex" xmlns:cx6="http://schemas.microsoft.com/office/drawing/2016/5/12/chartex" xmlns:cx7="http://schemas.microsoft.com/office/drawing/2016/5/13/chartex" xmlns:cx8="http://schemas.microsoft.com/office/drawing/2016/5/14/chartex" xmlns:mc="http://schemas.openxmlformats.org/markup-compatibility/2006" xmlns:aink="http://schemas.microsoft.com/office/drawing/2016/ink" xmlns:am3d="http://schemas.microsoft.com/office/drawing/2017/model3d" xmlns:o="urn:schemas-microsoft-com:office:office" xmlns:oel="http://schemas.microsoft.com/office/2019/extlst" xmlns:r="http://schemas.openxmlformats.org/officeDocument/2006/relationships" xmlns:m="http://schemas.openxmlformats.org/officeDocument/2006/math" xmlns:v="urn:schemas-microsoft-com:vml" xmlns:wp14="http://schemas.microsoft.com/office/word/2010/wordprocessingDrawing" xmlns:wp="http://schemas.openxmlformats.org/drawingml/2006/wordprocessingDrawing" xmlns:w10="urn:schemas-microsoft-com:office:word" xmlns:w="http://schemas.openxmlformats.org/wordprocessingml/2006/main" xmlns:w14="http://schemas.microsoft.com/office/word/2010/wordml" xmlns:w15="http://schemas.microsoft.com/office/word/2012/wordml" xmlns:w16cei="http://schemas.microsoft.com/office/word/2026/wordml/cei" xmlns:w16cex="http://schemas.microsoft.com/office/word/2018/wordml/cex" xmlns:w16cid="http://schemas.microsoft.com/office/word/2016/wordml/cid" xmlns:w16="http://schemas.microsoft.com/office/word/2018/wordml" xmlns:w16du="http://schemas.microsoft.com/office/word/2023/wordml/word16du" xmlns:w16sdtdh="http://schemas.microsoft.com/office/word/2020/wordml/sdtdatahash" xmlns:w16sdtfl="http://schemas.microsoft.com/office/word/2024/wordml/sdtformatlock" xmlns:w16se="http://schemas.microsoft.com/office/word/2015/wordml/symex" xmlns:wpg="http://schemas.microsoft.com/office/word/2010/wordprocessingGroup" xmlns:wpi="http://schemas.microsoft.com/office/word/2010/wordprocessingInk" xmlns:wne="http://schemas.microsoft.com/office/word/2006/wordml" xmlns:wps="http://schemas.microsoft.com/office/word/2010/wordprocessingShape" mc:Ignorable="w14 w15 w16se w16cid w16 w16cex w16sdtdh w16sdtfl w16du wp14">
   <w:p>
     <w:pPr>
       <w:pStyle w:val="Encabezado"/>
@@ -10797,7 +10770,7 @@
 </file>
 
 <file path=word/header2.xml><?xml version="1.0" encoding="utf-8"?>
-<w:hdr xmlns:wpc="http://schemas.microsoft.com/office/word/2010/wordprocessingCanvas" xmlns:cx="http://schemas.microsoft.com/office/drawing/2014/chartex" xmlns:cx1="http://schemas.microsoft.com/office/drawing/2015/9/8/chartex" xmlns:cx2="http://schemas.microsoft.com/office/drawing/2015/10/21/chartex" xmlns:cx3="http://schemas.microsoft.com/office/drawing/2016/5/9/chartex" xmlns:cx4="http://schemas.microsoft.com/office/drawing/2016/5/10/chartex" xmlns:cx5="http://schemas.microsoft.com/office/drawing/2016/5/11/chartex" xmlns:cx6="http://schemas.microsoft.com/office/drawing/2016/5/12/chartex" xmlns:cx7="http://schemas.microsoft.com/office/drawing/2016/5/13/chartex" xmlns:cx8="http://schemas.microsoft.com/office/drawing/2016/5/14/chartex" xmlns:mc="http://schemas.openxmlformats.org/markup-compatibility/2006" xmlns:aink="http://schemas.microsoft.com/office/drawing/2016/ink" xmlns:am3d="http://schemas.microsoft.com/office/drawing/2017/model3d" xmlns:o="urn:schemas-microsoft-com:office:office" xmlns:oel="http://schemas.microsoft.com/office/2019/extlst" xmlns:r="http://schemas.openxmlformats.org/officeDocument/2006/relationships" xmlns:m="http://schemas.openxmlformats.org/officeDocument/2006/math" xmlns:v="urn:schemas-microsoft-com:vml" xmlns:wp14="http://schemas.microsoft.com/office/word/2010/wordprocessingDrawing" xmlns:wp="http://schemas.openxmlformats.org/drawingml/2006/wordprocessingDrawing" xmlns:w10="urn:schemas-microsoft-com:office:word" xmlns:w="http://schemas.openxmlformats.org/wordprocessingml/2006/main" xmlns:w14="http://schemas.microsoft.com/office/word/2010/wordml" xmlns:w15="http://schemas.microsoft.com/office/word/2012/wordml" xmlns:w16cex="http://schemas.microsoft.com/office/word/2018/wordml/cex" xmlns:w16cid="http://schemas.microsoft.com/office/word/2016/wordml/cid" xmlns:w16="http://schemas.microsoft.com/office/word/2018/wordml" xmlns:w16du="http://schemas.microsoft.com/office/word/2023/wordml/word16du" xmlns:w16sdtdh="http://schemas.microsoft.com/office/word/2020/wordml/sdtdatahash" xmlns:w16sdtfl="http://schemas.microsoft.com/office/word/2024/wordml/sdtformatlock" xmlns:w16se="http://schemas.microsoft.com/office/word/2015/wordml/symex" xmlns:wpg="http://schemas.microsoft.com/office/word/2010/wordprocessingGroup" xmlns:wpi="http://schemas.microsoft.com/office/word/2010/wordprocessingInk" xmlns:wne="http://schemas.microsoft.com/office/word/2006/wordml" xmlns:wps="http://schemas.microsoft.com/office/word/2010/wordprocessingShape" mc:Ignorable="w14 w15 w16se w16cid w16 w16cex w16sdtdh w16sdtfl w16du wp14">
+<w:hdr xmlns:wpc="http://schemas.microsoft.com/office/word/2010/wordprocessingCanvas" xmlns:cx="http://schemas.microsoft.com/office/drawing/2014/chartex" xmlns:cx1="http://schemas.microsoft.com/office/drawing/2015/9/8/chartex" xmlns:cx2="http://schemas.microsoft.com/office/drawing/2015/10/21/chartex" xmlns:cx3="http://schemas.microsoft.com/office/drawing/2016/5/9/chartex" xmlns:cx4="http://schemas.microsoft.com/office/drawing/2016/5/10/chartex" xmlns:cx5="http://schemas.microsoft.com/office/drawing/2016/5/11/chartex" xmlns:cx6="http://schemas.microsoft.com/office/drawing/2016/5/12/chartex" xmlns:cx7="http://schemas.microsoft.com/office/drawing/2016/5/13/chartex" xmlns:cx8="http://schemas.microsoft.com/office/drawing/2016/5/14/chartex" xmlns:mc="http://schemas.openxmlformats.org/markup-compatibility/2006" xmlns:aink="http://schemas.microsoft.com/office/drawing/2016/ink" xmlns:am3d="http://schemas.microsoft.com/office/drawing/2017/model3d" xmlns:o="urn:schemas-microsoft-com:office:office" xmlns:oel="http://schemas.microsoft.com/office/2019/extlst" xmlns:r="http://schemas.openxmlformats.org/officeDocument/2006/relationships" xmlns:m="http://schemas.openxmlformats.org/officeDocument/2006/math" xmlns:v="urn:schemas-microsoft-com:vml" xmlns:wp14="http://schemas.microsoft.com/office/word/2010/wordprocessingDrawing" xmlns:wp="http://schemas.openxmlformats.org/drawingml/2006/wordprocessingDrawing" xmlns:w10="urn:schemas-microsoft-com:office:word" xmlns:w="http://schemas.openxmlformats.org/wordprocessingml/2006/main" xmlns:w14="http://schemas.microsoft.com/office/word/2010/wordml" xmlns:w15="http://schemas.microsoft.com/office/word/2012/wordml" xmlns:w16cei="http://schemas.microsoft.com/office/word/2026/wordml/cei" xmlns:w16cex="http://schemas.microsoft.com/office/word/2018/wordml/cex" xmlns:w16cid="http://schemas.microsoft.com/office/word/2016/wordml/cid" xmlns:w16="http://schemas.microsoft.com/office/word/2018/wordml" xmlns:w16du="http://schemas.microsoft.com/office/word/2023/wordml/word16du" xmlns:w16sdtdh="http://schemas.microsoft.com/office/word/2020/wordml/sdtdatahash" xmlns:w16sdtfl="http://schemas.microsoft.com/office/word/2024/wordml/sdtformatlock" xmlns:w16se="http://schemas.microsoft.com/office/word/2015/wordml/symex" xmlns:wpg="http://schemas.microsoft.com/office/word/2010/wordprocessingGroup" xmlns:wpi="http://schemas.microsoft.com/office/word/2010/wordprocessingInk" xmlns:wne="http://schemas.microsoft.com/office/word/2006/wordml" xmlns:wps="http://schemas.microsoft.com/office/word/2010/wordprocessingShape" mc:Ignorable="w14 w15 w16se w16cid w16 w16cex w16sdtdh w16sdtfl w16du wp14">
   <w:p>
     <w:pPr>
       <w:pStyle w:val="Textoindependiente"/>
@@ -10979,7 +10952,7 @@
 </file>
 
 <file path=word/header3.xml><?xml version="1.0" encoding="utf-8"?>
-<w:hdr xmlns:wpc="http://schemas.microsoft.com/office/word/2010/wordprocessingCanvas" xmlns:cx="http://schemas.microsoft.com/office/drawing/2014/chartex" xmlns:cx1="http://schemas.microsoft.com/office/drawing/2015/9/8/chartex" xmlns:cx2="http://schemas.microsoft.com/office/drawing/2015/10/21/chartex" xmlns:cx3="http://schemas.microsoft.com/office/drawing/2016/5/9/chartex" xmlns:cx4="http://schemas.microsoft.com/office/drawing/2016/5/10/chartex" xmlns:cx5="http://schemas.microsoft.com/office/drawing/2016/5/11/chartex" xmlns:cx6="http://schemas.microsoft.com/office/drawing/2016/5/12/chartex" xmlns:cx7="http://schemas.microsoft.com/office/drawing/2016/5/13/chartex" xmlns:cx8="http://schemas.microsoft.com/office/drawing/2016/5/14/chartex" xmlns:mc="http://schemas.openxmlformats.org/markup-compatibility/2006" xmlns:aink="http://schemas.microsoft.com/office/drawing/2016/ink" xmlns:am3d="http://schemas.microsoft.com/office/drawing/2017/model3d" xmlns:o="urn:schemas-microsoft-com:office:office" xmlns:oel="http://schemas.microsoft.com/office/2019/extlst" xmlns:r="http://schemas.openxmlformats.org/officeDocument/2006/relationships" xmlns:m="http://schemas.openxmlformats.org/officeDocument/2006/math" xmlns:v="urn:schemas-microsoft-com:vml" xmlns:wp14="http://schemas.microsoft.com/office/word/2010/wordprocessingDrawing" xmlns:wp="http://schemas.openxmlformats.org/drawingml/2006/wordprocessingDrawing" xmlns:w10="urn:schemas-microsoft-com:office:word" xmlns:w="http://schemas.openxmlformats.org/wordprocessingml/2006/main" xmlns:w14="http://schemas.microsoft.com/office/word/2010/wordml" xmlns:w15="http://schemas.microsoft.com/office/word/2012/wordml" xmlns:w16cex="http://schemas.microsoft.com/office/word/2018/wordml/cex" xmlns:w16cid="http://schemas.microsoft.com/office/word/2016/wordml/cid" xmlns:w16="http://schemas.microsoft.com/office/word/2018/wordml" xmlns:w16du="http://schemas.microsoft.com/office/word/2023/wordml/word16du" xmlns:w16sdtdh="http://schemas.microsoft.com/office/word/2020/wordml/sdtdatahash" xmlns:w16sdtfl="http://schemas.microsoft.com/office/word/2024/wordml/sdtformatlock" xmlns:w16se="http://schemas.microsoft.com/office/word/2015/wordml/symex" xmlns:wpg="http://schemas.microsoft.com/office/word/2010/wordprocessingGroup" xmlns:wpi="http://schemas.microsoft.com/office/word/2010/wordprocessingInk" xmlns:wne="http://schemas.microsoft.com/office/word/2006/wordml" xmlns:wps="http://schemas.microsoft.com/office/word/2010/wordprocessingShape" mc:Ignorable="w14 w15 w16se w16cid w16 w16cex w16sdtdh w16sdtfl w16du wp14">
+<w:hdr xmlns:wpc="http://schemas.microsoft.com/office/word/2010/wordprocessingCanvas" xmlns:cx="http://schemas.microsoft.com/office/drawing/2014/chartex" xmlns:cx1="http://schemas.microsoft.com/office/drawing/2015/9/8/chartex" xmlns:cx2="http://schemas.microsoft.com/office/drawing/2015/10/21/chartex" xmlns:cx3="http://schemas.microsoft.com/office/drawing/2016/5/9/chartex" xmlns:cx4="http://schemas.microsoft.com/office/drawing/2016/5/10/chartex" xmlns:cx5="http://schemas.microsoft.com/office/drawing/2016/5/11/chartex" xmlns:cx6="http://schemas.microsoft.com/office/drawing/2016/5/12/chartex" xmlns:cx7="http://schemas.microsoft.com/office/drawing/2016/5/13/chartex" xmlns:cx8="http://schemas.microsoft.com/office/drawing/2016/5/14/chartex" xmlns:mc="http://schemas.openxmlformats.org/markup-compatibility/2006" xmlns:aink="http://schemas.microsoft.com/office/drawing/2016/ink" xmlns:am3d="http://schemas.microsoft.com/office/drawing/2017/model3d" xmlns:o="urn:schemas-microsoft-com:office:office" xmlns:oel="http://schemas.microsoft.com/office/2019/extlst" xmlns:r="http://schemas.openxmlformats.org/officeDocument/2006/relationships" xmlns:m="http://schemas.openxmlformats.org/officeDocument/2006/math" xmlns:v="urn:schemas-microsoft-com:vml" xmlns:wp14="http://schemas.microsoft.com/office/word/2010/wordprocessingDrawing" xmlns:wp="http://schemas.openxmlformats.org/drawingml/2006/wordprocessingDrawing" xmlns:w10="urn:schemas-microsoft-com:office:word" xmlns:w="http://schemas.openxmlformats.org/wordprocessingml/2006/main" xmlns:w14="http://schemas.microsoft.com/office/word/2010/wordml" xmlns:w15="http://schemas.microsoft.com/office/word/2012/wordml" xmlns:w16cei="http://schemas.microsoft.com/office/word/2026/wordml/cei" xmlns:w16cex="http://schemas.microsoft.com/office/word/2018/wordml/cex" xmlns:w16cid="http://schemas.microsoft.com/office/word/2016/wordml/cid" xmlns:w16="http://schemas.microsoft.com/office/word/2018/wordml" xmlns:w16du="http://schemas.microsoft.com/office/word/2023/wordml/word16du" xmlns:w16sdtdh="http://schemas.microsoft.com/office/word/2020/wordml/sdtdatahash" xmlns:w16sdtfl="http://schemas.microsoft.com/office/word/2024/wordml/sdtformatlock" xmlns:w16se="http://schemas.microsoft.com/office/word/2015/wordml/symex" xmlns:wpg="http://schemas.microsoft.com/office/word/2010/wordprocessingGroup" xmlns:wpi="http://schemas.microsoft.com/office/word/2010/wordprocessingInk" xmlns:wne="http://schemas.microsoft.com/office/word/2006/wordml" xmlns:wps="http://schemas.microsoft.com/office/word/2010/wordprocessingShape" mc:Ignorable="w14 w15 w16se w16cid w16 w16cex w16sdtdh w16sdtfl w16du wp14">
   <w:p>
     <w:pPr>
       <w:pStyle w:val="Encabezado"/>
@@ -11396,6 +11369,7 @@
   <w:style w:type="character" w:default="1" w:styleId="Fuentedeprrafopredeter">
     <w:name w:val="Default Paragraph Font"/>
     <w:uiPriority w:val="1"/>
+    <w:semiHidden/>
     <w:unhideWhenUsed/>
   </w:style>
   <w:style w:type="table" w:default="1" w:styleId="Tablanormal">

</xml_diff>